<commit_message>
Workshop: nombres de los integrantes sin línea de firma (Word y PDF)
</commit_message>
<xml_diff>
--- a/docs/Workshop_Impacto_Social_y_Responsabilidad_LEMAS.docx
+++ b/docs/Workshop_Impacto_Social_y_Responsabilidad_LEMAS.docx
@@ -2458,6 +2458,7 @@
     <w:p>
       <w:pPr>
         <w:pStyle w:val="Heading1"/>
+        <w:pageBreakBefore/>
       </w:pPr>
       <w:r>
         <w:t xml:space="preserve">Parte 3. Evaluación de impacto social</w:t>
@@ -4839,7 +4840,7 @@
                 <w:sz w:val="18"/>
                 <w:szCs w:val="18"/>
               </w:rPr>
-              <w:t xml:space="preserve">Si la regla falla, la familia recibe la atención habitual. Los errores posibles son una llamada innecesaria o una familia no listada. Hay 176 pruebas automáticas y un criterio para suspender el sistema</w:t>
+              <w:t xml:space="preserve">Si la regla falla, la familia recibe la atención habitual. Los errores posibles son una llamada innecesaria o una familia no listada. Hay 179 pruebas automáticas y un criterio para suspender el sistema</w:t>
             </w:r>
           </w:p>
         </w:tc>
@@ -7176,7 +7177,7 @@
                 <w:sz w:val="18"/>
                 <w:szCs w:val="18"/>
               </w:rPr>
-              <w:t xml:space="preserve">3. Celdas con menos de 5 casos ocultas; repositorio sin datos reales</w:t>
+              <w:t xml:space="preserve">3. Celdas con menos de 5 casos ocultas, sin que se puedan deducir por diferencia; repositorio sin datos reales</w:t>
             </w:r>
           </w:p>
         </w:tc>
@@ -7248,7 +7249,7 @@
                 <w:sz w:val="18"/>
                 <w:szCs w:val="18"/>
               </w:rPr>
-              <w:t xml:space="preserve"> Implementada en lo técnico. Pendientes: ocultar una celda más en la tabla de proyección y que LEMAS designe quién ve los nombres</w:t>
+              <w:t xml:space="preserve"> Implementada en lo técnico. Pendiente: que LEMAS designe quién ve los nombres</w:t>
             </w:r>
           </w:p>
         </w:tc>
@@ -7963,7 +7964,7 @@
                 <w:sz w:val="18"/>
                 <w:szCs w:val="18"/>
               </w:rPr>
-              <w:t xml:space="preserve">176 pruebas automáticas e integración continua en cada cambio; los cambios entran por pull request</w:t>
+              <w:t xml:space="preserve">179 pruebas automáticas e integración continua en cada cambio; los cambios entran por pull request</w:t>
             </w:r>
           </w:p>
         </w:tc>
@@ -8179,7 +8180,7 @@
                 <w:sz w:val="18"/>
                 <w:szCs w:val="18"/>
               </w:rPr>
-              <w:t xml:space="preserve">Registro de 52 decisiones con fecha y motivo</w:t>
+              <w:t xml:space="preserve">Registro de 53 decisiones con fecha y motivo</w:t>
             </w:r>
           </w:p>
         </w:tc>
@@ -12087,10 +12088,7 @@
           </w:tcPr>
           <w:p>
             <w:pPr>
-              <w:pBdr>
-                <w:top w:val="single" w:color="333333" w:sz="6" w:space="4"/>
-              </w:pBdr>
-              <w:spacing w:after="40" w:before="620"/>
+              <w:spacing w:after="40" w:before="240"/>
               <w:jc w:val="center"/>
             </w:pPr>
             <w:r>
@@ -12136,10 +12134,7 @@
           </w:tcPr>
           <w:p>
             <w:pPr>
-              <w:pBdr>
-                <w:top w:val="single" w:color="333333" w:sz="6" w:space="4"/>
-              </w:pBdr>
-              <w:spacing w:after="40" w:before="620"/>
+              <w:spacing w:after="40" w:before="240"/>
               <w:jc w:val="center"/>
             </w:pPr>
             <w:r>

</xml_diff>

<commit_message>
D60: retroalimentación docente y segunda revisión
</commit_message>
<xml_diff>
--- a/docs/Workshop_Impacto_Social_y_Responsabilidad_LEMAS.docx
+++ b/docs/Workshop_Impacto_Social_y_Responsabilidad_LEMAS.docx
@@ -126,7 +126,7 @@
         <w:t xml:space="preserve">Funcionalidad principal.</w:t>
       </w:r>
       <w:r>
-        <w:t xml:space="preserve"> El 20 de febrero el sistema ordena a las familias con reserva aprobada para decidir a cuáles llamar primero, y muestra el motivo de cada una. El orden sale de una regla simple (D2): primero quien pagó tarde la matrícula anterior, luego quien hizo reserva extraordinaria y luego quien tuvo más pensiones atrasadas. También proyecta la matrícula por sede y subnivel y, unas semanas después, lista a las familias que siguen sin pagar. Comparamos tres modelos de aprendizaje automático con esa regla y ninguno la superó: la IA nos sirvió para descubrir la regla, validarla y medir su incertidumbre.</w:t>
+        <w:t xml:space="preserve"> El 20 de febrero el sistema ordena a las familias con reserva aprobada para decidir a cuáles llamar primero, y muestra el motivo de cada una. El orden sale de una regla simple (D2): primero quien pagó tarde la matrícula anterior, luego quien hizo reserva extraordinaria y luego quien tuvo más pensiones atrasadas. También proyecta la matrícula por sede y subnivel y, unas semanas después, lista a las familias que siguen sin pagar. Comparamos tres modelos de aprendizaje automático con esa regla y ninguno la superó: la regla salió del análisis de datos, y el aprendizaje automático sirvió para comprobar que no había más señal que aprovechar y para medir su incertidumbre.</w:t>
       </w:r>
     </w:p>
     <w:p>
@@ -3183,6 +3183,72 @@
     </w:tbl>
     <w:p>
       <w:pPr>
+        <w:spacing w:before="120" w:after="100"/>
+        <w:jc w:val="both"/>
+      </w:pPr>
+      <w:r>
+        <w:rPr>
+          <w:b/>
+          <w:bCs/>
+        </w:rPr>
+        <w:t xml:space="preserve">Estado de cada impacto (agregado en la revisión final). </w:t>
+      </w:r>
+      <w:r>
+        <w:t xml:space="preserve">1. Apoyo más oportuno: </w:t>
+      </w:r>
+      <w:r>
+        <w:rPr>
+          <w:b/>
+          <w:bCs/>
+        </w:rPr>
+        <w:t xml:space="preserve">medido</w:t>
+      </w:r>
+      <w:r>
+        <w:t xml:space="preserve"> a quién encuentra la lista (22 de 74 casos; 7,5 llamadas por caso hallado frente a unas 15 al azar); </w:t>
+      </w:r>
+      <w:r>
+        <w:rPr>
+          <w:b/>
+          <w:bCs/>
+        </w:rPr>
+        <w:t xml:space="preserve">pendiente de medir</w:t>
+      </w:r>
+      <w:r>
+        <w:t xml:space="preserve"> si la llamada aumenta la matrícula (reserva al azar, Parte 5). 2. Trabajo del personal: </w:t>
+      </w:r>
+      <w:r>
+        <w:rPr>
+          <w:b/>
+          <w:bCs/>
+        </w:rPr>
+        <w:t xml:space="preserve">pendiente de medir</w:t>
+      </w:r>
+      <w:r>
+        <w:t xml:space="preserve"> con Secretaría y Admisiones. 3. Planificación: </w:t>
+      </w:r>
+      <w:r>
+        <w:rPr>
+          <w:b/>
+          <w:bCs/>
+        </w:rPr>
+        <w:t xml:space="preserve">medido</w:t>
+      </w:r>
+      <w:r>
+        <w:t xml:space="preserve"> (error del 2,8 %). 4. Protección de datos: </w:t>
+      </w:r>
+      <w:r>
+        <w:rPr>
+          <w:b/>
+          <w:bCs/>
+        </w:rPr>
+        <w:t xml:space="preserve">implementado</w:t>
+      </w:r>
+      <w:r>
+        <w:t xml:space="preserve">. Los impactos 1 y 2 son esperados, no comprobados.</w:t>
+      </w:r>
+    </w:p>
+    <w:p>
+      <w:pPr>
         <w:spacing w:after="100"/>
       </w:pPr>
     </w:p>
@@ -4375,7 +4441,7 @@
         <w:jc w:val="both"/>
       </w:pPr>
       <w:r>
-        <w:t xml:space="preserve">Con 11 casos entre becadas no sabemos si la diferencia es real. La informamos como alerta y la vigilamos (Parte 5).</w:t>
+        <w:t xml:space="preserve">Con 11 casos entre becadas no sabemos si la diferencia es real. Intervalos y prueba exacta (agregados en la revisión final): el recall de las becadas es 18 % [IC 95 % de Wilson: 5 %; 48 %] y el de las demás, 32 % [22 %; 44 %]; la prueba exacta de Fisher da p = 0,49, y la razón de selección es 0,66 [0,41; 1,05] (p = 0,08). Entre sedes, el recall es 32 % [20 %; 47 %] en Mucho Lote 1 y 27 % [14 %; 44 %] en Mucho Lote 2 (p = 0,80); la menor selección en Mucho Lote 2 sale del diseño (k proporcional a cada sede). Ninguna brecha es demostrable, pero tampoco descartable con tan pocos casos. La informamos como alerta y la vigilamos acumulando cohortes (Parte 5).</w:t>
       </w:r>
     </w:p>
     <w:p>
@@ -4840,7 +4906,7 @@
                 <w:sz w:val="18"/>
                 <w:szCs w:val="18"/>
               </w:rPr>
-              <w:t xml:space="preserve">Si la regla falla, la familia recibe la atención habitual. Los errores posibles son una llamada innecesaria o una familia no listada. Hay 179 pruebas automáticas y un criterio para suspender el sistema</w:t>
+              <w:t xml:space="preserve">Si la regla falla, la familia recibe la atención habitual. Los errores posibles son una llamada innecesaria o una familia no listada. Hay 255 pruebas automáticas y un criterio para suspender el sistema</w:t>
             </w:r>
           </w:p>
         </w:tc>
@@ -6765,7 +6831,7 @@
                 <w:sz w:val="18"/>
                 <w:szCs w:val="18"/>
               </w:rPr>
-              <w:t xml:space="preserve">3. Reservar parte de los contactos para familias elegidas al azar</w:t>
+              <w:t xml:space="preserve">3. Reservar parte de los contactos para familias elegidas al azar. Con la mitad de la lista reservada, detectar que la llamada reduce la no matrícula a la mitad exige unas 634 familias (unas 4 campañas); un efecto del 25 %, unas 2.900 (unas 18). Para efectos moderados hay que ampliar la reserva a la segunda etapa o acumular cohortes</w:t>
             </w:r>
           </w:p>
         </w:tc>
@@ -7964,7 +8030,7 @@
                 <w:sz w:val="18"/>
                 <w:szCs w:val="18"/>
               </w:rPr>
-              <w:t xml:space="preserve">179 pruebas automáticas e integración continua en cada cambio; los cambios entran por pull request</w:t>
+              <w:t xml:space="preserve">255 pruebas automáticas e integración continua en cada cambio; los cambios entran por pull request</w:t>
             </w:r>
           </w:p>
         </w:tc>
@@ -11679,6 +11745,168 @@
                 <w:sz w:val="18"/>
                 <w:szCs w:val="18"/>
               </w:rPr>
+              <w:t xml:space="preserve">Normativa educativa (LOEI; Reglamento General de 2023; Acuerdo MINEDUC-MINEDUC-2025-00030-A)</w:t>
+            </w:r>
+          </w:p>
+        </w:tc>
+        <w:tc>
+          <w:tcPr>
+            <w:tcW w:type="dxa" w:w="1058"/>
+            <w:tcBorders>
+              <w:top w:val="single" w:color="BFBFBF" w:sz="4"/>
+              <w:left w:val="single" w:color="BFBFBF" w:sz="4"/>
+              <w:bottom w:val="single" w:color="BFBFBF" w:sz="4"/>
+              <w:right w:val="single" w:color="BFBFBF" w:sz="4"/>
+            </w:tcBorders>
+            <w:tcMar>
+              <w:top w:type="dxa" w:w="40"/>
+              <w:left w:type="dxa" w:w="80"/>
+              <w:bottom w:type="dxa" w:w="40"/>
+              <w:right w:type="dxa" w:w="80"/>
+            </w:tcMar>
+            <w:vAlign w:val="top"/>
+          </w:tcPr>
+          <w:p>
+            <w:pPr>
+              <w:spacing w:after="0"/>
+            </w:pPr>
+            <w:r>
+              <w:rPr>
+                <w:color w:val="000000"/>
+                <w:sz w:val="18"/>
+                <w:szCs w:val="18"/>
+              </w:rPr>
+              <w:t xml:space="preserve">Sí</w:t>
+            </w:r>
+          </w:p>
+        </w:tc>
+        <w:tc>
+          <w:tcPr>
+            <w:tcW w:type="dxa" w:w="2841"/>
+            <w:tcBorders>
+              <w:top w:val="single" w:color="BFBFBF" w:sz="4"/>
+              <w:left w:val="single" w:color="BFBFBF" w:sz="4"/>
+              <w:bottom w:val="single" w:color="BFBFBF" w:sz="4"/>
+              <w:right w:val="single" w:color="BFBFBF" w:sz="4"/>
+            </w:tcBorders>
+            <w:tcMar>
+              <w:top w:type="dxa" w:w="40"/>
+              <w:left w:type="dxa" w:w="80"/>
+              <w:bottom w:type="dxa" w:w="40"/>
+              <w:right w:type="dxa" w:w="80"/>
+            </w:tcMar>
+            <w:vAlign w:val="top"/>
+          </w:tcPr>
+          <w:p>
+            <w:pPr>
+              <w:spacing w:after="0"/>
+            </w:pPr>
+            <w:r>
+              <w:rPr>
+                <w:color w:val="000000"/>
+                <w:sz w:val="18"/>
+                <w:szCs w:val="18"/>
+              </w:rPr>
+              <w:t xml:space="preserve">Cobrar solo rubros autorizados; no retener documentos ni impedir evaluaciones por falta de pago; procedimiento ante el distrito con más de tres meses de mora</w:t>
+            </w:r>
+          </w:p>
+        </w:tc>
+        <w:tc>
+          <w:tcPr>
+            <w:tcW w:type="dxa" w:w="1949"/>
+            <w:tcBorders>
+              <w:top w:val="single" w:color="BFBFBF" w:sz="4"/>
+              <w:left w:val="single" w:color="BFBFBF" w:sz="4"/>
+              <w:bottom w:val="single" w:color="BFBFBF" w:sz="4"/>
+              <w:right w:val="single" w:color="BFBFBF" w:sz="4"/>
+            </w:tcBorders>
+            <w:tcMar>
+              <w:top w:type="dxa" w:w="40"/>
+              <w:left w:type="dxa" w:w="80"/>
+              <w:bottom w:type="dxa" w:w="40"/>
+              <w:right w:type="dxa" w:w="80"/>
+            </w:tcMar>
+            <w:vAlign w:val="top"/>
+          </w:tcPr>
+          <w:p>
+            <w:pPr>
+              <w:spacing w:after="0"/>
+            </w:pPr>
+            <w:r>
+              <w:rPr>
+                <w:color w:val="000000"/>
+                <w:sz w:val="18"/>
+                <w:szCs w:val="18"/>
+              </w:rPr>
+              <w:t xml:space="preserve">Sí: la lista no genera cobros y su uso para cobrar o negar matrícula está prohibido</w:t>
+            </w:r>
+          </w:p>
+        </w:tc>
+        <w:tc>
+          <w:tcPr>
+            <w:tcW w:type="dxa" w:w="1785"/>
+            <w:tcBorders>
+              <w:top w:val="single" w:color="BFBFBF" w:sz="4"/>
+              <w:left w:val="single" w:color="BFBFBF" w:sz="4"/>
+              <w:bottom w:val="single" w:color="BFBFBF" w:sz="4"/>
+              <w:right w:val="single" w:color="BFBFBF" w:sz="4"/>
+            </w:tcBorders>
+            <w:tcMar>
+              <w:top w:type="dxa" w:w="40"/>
+              <w:left w:type="dxa" w:w="80"/>
+              <w:bottom w:type="dxa" w:w="40"/>
+              <w:right w:type="dxa" w:w="80"/>
+            </w:tcMar>
+            <w:vAlign w:val="top"/>
+          </w:tcPr>
+          <w:p>
+            <w:pPr>
+              <w:spacing w:after="0"/>
+            </w:pPr>
+            <w:r>
+              <w:rPr>
+                <w:color w:val="000000"/>
+                <w:sz w:val="18"/>
+                <w:szCs w:val="18"/>
+              </w:rPr>
+              <w:t xml:space="preserve">Confirmar con el asesor los artículos vigentes de la LOEI</w:t>
+            </w:r>
+          </w:p>
+        </w:tc>
+      </w:tr>
+      <w:tr>
+        <w:trPr>
+          <w:cantSplit/>
+        </w:trPr>
+        <w:tc>
+          <w:tcPr>
+            <w:tcW w:type="dxa" w:w="2005"/>
+            <w:tcBorders>
+              <w:top w:val="single" w:color="BFBFBF" w:sz="4"/>
+              <w:left w:val="single" w:color="BFBFBF" w:sz="4"/>
+              <w:bottom w:val="single" w:color="BFBFBF" w:sz="4"/>
+              <w:right w:val="single" w:color="BFBFBF" w:sz="4"/>
+            </w:tcBorders>
+            <w:tcMar>
+              <w:top w:type="dxa" w:w="40"/>
+              <w:left w:type="dxa" w:w="80"/>
+              <w:bottom w:type="dxa" w:w="40"/>
+              <w:right w:type="dxa" w:w="80"/>
+            </w:tcMar>
+            <w:vAlign w:val="top"/>
+          </w:tcPr>
+          <w:p>
+            <w:pPr>
+              <w:spacing w:after="0"/>
+            </w:pPr>
+            <w:r>
+              <w:rPr>
+                <w:b/>
+                <w:bCs/>
+                <w:color w:val="000000"/>
+                <w:sz w:val="18"/>
+                <w:szCs w:val="18"/>
+              </w:rPr>
               <w:t xml:space="preserve">Leyes laborales</w:t>
             </w:r>
           </w:p>
@@ -12050,131 +12278,35 @@
         <w:t xml:space="preserve">Mantener la transparencia sobre las limitaciones: la lista no alcanza al 70 % de los casos y los modelos de IA no superaron a una regla simple.</w:t>
       </w:r>
     </w:p>
-    <w:tbl>
-      <w:tblPr>
-        <w:tblW w:type="dxa" w:w="9638"/>
-        <w:tblBorders>
-          <w:top w:val="single" w:color="auto" w:sz="4"/>
-          <w:left w:val="single" w:color="auto" w:sz="4"/>
-          <w:bottom w:val="single" w:color="auto" w:sz="4"/>
-          <w:right w:val="single" w:color="auto" w:sz="4"/>
-          <w:insideH w:val="single" w:color="auto" w:sz="4"/>
-          <w:insideV w:val="single" w:color="auto" w:sz="4"/>
-        </w:tblBorders>
-      </w:tblPr>
-      <w:tblGrid>
-        <w:gridCol w:w="4819"/>
-        <w:gridCol w:w="4819"/>
-      </w:tblGrid>
-      <w:tr>
-        <w:trPr>
-          <w:cantSplit/>
-        </w:trPr>
-        <w:tc>
-          <w:tcPr>
-            <w:tcW w:type="dxa" w:w="4819"/>
-            <w:tcBorders>
-              <w:top w:val="none" w:color="FFFFFF" w:sz="0"/>
-              <w:left w:val="none" w:color="FFFFFF" w:sz="0"/>
-              <w:bottom w:val="none" w:color="FFFFFF" w:sz="0"/>
-              <w:right w:val="none" w:color="FFFFFF" w:sz="0"/>
-            </w:tcBorders>
-            <w:tcMar>
-              <w:top w:type="dxa" w:w="0"/>
-              <w:left w:type="dxa" w:w="300"/>
-              <w:bottom w:type="dxa" w:w="0"/>
-              <w:right w:type="dxa" w:w="300"/>
-            </w:tcMar>
-          </w:tcPr>
-          <w:p>
-            <w:pPr>
-              <w:spacing w:after="40" w:before="240"/>
-              <w:jc w:val="center"/>
-            </w:pPr>
-            <w:r>
-              <w:rPr>
-                <w:b/>
-                <w:bCs/>
-                <w:sz w:val="20"/>
-                <w:szCs w:val="20"/>
-              </w:rPr>
-              <w:t xml:space="preserve">Guillermo Leonidas Granizo Veintimilla</w:t>
-            </w:r>
-          </w:p>
-          <w:p>
-            <w:pPr>
-              <w:spacing w:after="0"/>
-              <w:jc w:val="center"/>
-            </w:pPr>
-            <w:r>
-              <w:rPr>
-                <w:color w:val="555555"/>
-                <w:sz w:val="18"/>
-                <w:szCs w:val="18"/>
-              </w:rPr>
-              <w:t xml:space="preserve">Product Owner</w:t>
-            </w:r>
-          </w:p>
-        </w:tc>
-        <w:tc>
-          <w:tcPr>
-            <w:tcW w:type="dxa" w:w="4819"/>
-            <w:tcBorders>
-              <w:top w:val="none" w:color="FFFFFF" w:sz="0"/>
-              <w:left w:val="none" w:color="FFFFFF" w:sz="0"/>
-              <w:bottom w:val="none" w:color="FFFFFF" w:sz="0"/>
-              <w:right w:val="none" w:color="FFFFFF" w:sz="0"/>
-            </w:tcBorders>
-            <w:tcMar>
-              <w:top w:type="dxa" w:w="0"/>
-              <w:left w:type="dxa" w:w="300"/>
-              <w:bottom w:type="dxa" w:w="0"/>
-              <w:right w:type="dxa" w:w="300"/>
-            </w:tcMar>
-          </w:tcPr>
-          <w:p>
-            <w:pPr>
-              <w:spacing w:after="40" w:before="240"/>
-              <w:jc w:val="center"/>
-            </w:pPr>
-            <w:r>
-              <w:rPr>
-                <w:b/>
-                <w:bCs/>
-                <w:sz w:val="20"/>
-                <w:szCs w:val="20"/>
-              </w:rPr>
-              <w:t xml:space="preserve">José Farid Ulloa Manzur</w:t>
-            </w:r>
-          </w:p>
-          <w:p>
-            <w:pPr>
-              <w:spacing w:after="0"/>
-              <w:jc w:val="center"/>
-            </w:pPr>
-            <w:r>
-              <w:rPr>
-                <w:color w:val="555555"/>
-                <w:sz w:val="18"/>
-                <w:szCs w:val="18"/>
-              </w:rPr>
-              <w:t xml:space="preserve">Scrum Master</w:t>
-            </w:r>
-          </w:p>
-        </w:tc>
-      </w:tr>
-    </w:tbl>
     <w:p>
       <w:pPr>
-        <w:spacing w:after="160" w:before="120"/>
+        <w:spacing w:after="160" w:before="240"/>
         <w:jc w:val="center"/>
       </w:pPr>
       <w:r>
         <w:rPr>
-          <w:sz w:val="20"/>
-          <w:szCs w:val="20"/>
+          <w:b/>
+          <w:bCs/>
         </w:rPr>
-        <w:t xml:space="preserve">Guayaquil, 3 de octubre de 2026</w:t>
+        <w:t xml:space="preserve">Aprobado por los autores</w:t>
+      </w:r>
+    </w:p>
+    <w:p>
+      <w:pPr>
+        <w:spacing w:after="40"/>
+        <w:jc w:val="center"/>
+      </w:pPr>
+      <w:r>
+        <w:t xml:space="preserve">Guillermo Leonidas Granizo Veintimilla (Product Owner) y José Farid Ulloa Manzur (Scrum Master)</w:t>
+      </w:r>
+    </w:p>
+    <w:p>
+      <w:pPr>
+        <w:spacing w:after="160"/>
+        <w:jc w:val="center"/>
+      </w:pPr>
+      <w:r>
+        <w:t xml:space="preserve">Guayaquil, 3 de octubre de 2026 · revisado el 20 de octubre de 2026</w:t>
       </w:r>
     </w:p>
     <w:p>

</xml_diff>